<commit_message>
Add Lumos SDK installer and customer setup guide
</commit_message>
<xml_diff>
--- a/docs/StarArm102_Lumos_Python_Teleoperation_Guide.docx
+++ b/docs/StarArm102_Lumos_Python_Teleoperation_Guide.docx
@@ -496,7 +496,117 @@
           <w:color w:val="27648A"/>
           <w:sz w:val="22"/>
         </w:rPr>
-        <w:t>安装 Python 依赖</w:t>
+        <w:t>下载程序并一键安装依赖</w:t>
+      </w:r>
+    </w:p>
+    <w:p>
+      <w:pPr>
+        <w:pStyle w:val="CodeBlock"/>
+        <w:keepLines/>
+        <w:spacing w:before="40" w:after="140"/>
+        <w:ind w:left="202" w:right="115"/>
+        <w:shd w:fill="F3F6F8"/>
+      </w:pPr>
+      <w:r>
+        <w:rPr>
+          <w:rFonts w:ascii="Consolas" w:hAnsi="Consolas" w:eastAsia="Consolas"/>
+          <w:color w:val="203B50"/>
+          <w:sz w:val="17"/>
+        </w:rPr>
+        <w:t>git clone https://github.com/VincentHSS/stararm102-lumos-teleop.git</w:t>
+      </w:r>
+      <w:r>
+        <w:br/>
+      </w:r>
+      <w:r>
+        <w:rPr>
+          <w:rFonts w:ascii="Consolas" w:hAnsi="Consolas" w:eastAsia="Consolas"/>
+          <w:color w:val="203B50"/>
+          <w:sz w:val="17"/>
+        </w:rPr>
+        <w:t>cd stararm102-lumos-teleop</w:t>
+      </w:r>
+      <w:r>
+        <w:br/>
+      </w:r>
+      <w:r>
+        <w:rPr>
+          <w:rFonts w:ascii="Consolas" w:hAnsi="Consolas" w:eastAsia="Consolas"/>
+          <w:color w:val="203B50"/>
+          <w:sz w:val="17"/>
+        </w:rPr>
+        <w:t>bash scripts/install_ubuntu.sh</w:t>
+      </w:r>
+    </w:p>
+    <w:p>
+      <w:pPr>
+        <w:spacing w:after="100" w:line="269" w:lineRule="auto"/>
+      </w:pPr>
+      <w:r>
+        <w:rPr>
+          <w:rFonts w:ascii="Microsoft YaHei" w:hAnsi="Microsoft YaHei" w:eastAsia="Microsoft YaHei"/>
+          <w:color w:val="263746"/>
+          <w:sz w:val="19"/>
+        </w:rPr>
+        <w:t>请先激活 Python 3.10 环境。安装脚本会安装 C++ 构建依赖和 StarArm Python 包，并自动将 Lumos SDK 下载到项目的 .dependencies/startouch_sdk 目录后完成安装。整个过程需要联网和 sudo 权限；不需要手动进入 SDK 源码目录。</w:t>
+      </w:r>
+    </w:p>
+    <w:p>
+      <w:pPr>
+        <w:spacing w:after="100" w:line="269" w:lineRule="auto"/>
+      </w:pPr>
+      <w:r>
+        <w:rPr>
+          <w:rFonts w:ascii="Microsoft YaHei" w:hAnsi="Microsoft YaHei" w:eastAsia="Microsoft YaHei"/>
+          <w:color w:val="263746"/>
+          <w:sz w:val="19"/>
+        </w:rPr>
+        <w:t>Lumos SDK 源码由脚本从 Lumos 官方仓库自动获取，本项目不复制或再分发该 SDK 源码。安装完成后可检查接口：</w:t>
+      </w:r>
+    </w:p>
+    <w:p>
+      <w:pPr>
+        <w:pStyle w:val="CodeBlock"/>
+        <w:keepLines/>
+        <w:spacing w:before="40" w:after="140"/>
+        <w:ind w:left="202" w:right="115"/>
+        <w:shd w:fill="F3F6F8"/>
+      </w:pPr>
+      <w:r>
+        <w:rPr>
+          <w:rFonts w:ascii="Consolas" w:hAnsi="Consolas" w:eastAsia="Consolas"/>
+          <w:color w:val="203B50"/>
+          <w:sz w:val="17"/>
+        </w:rPr>
+        <w:t>python -c "import serial, fashionstar_uart_sdk; from startouchclass import SingleArm; print('SDK OK')"</w:t>
+      </w:r>
+    </w:p>
+    <w:p>
+      <w:pPr>
+        <w:pStyle w:val="Heading2"/>
+        <w:keepNext/>
+      </w:pPr>
+      <w:r>
+        <w:rPr>
+          <w:rFonts w:ascii="Microsoft YaHei" w:hAnsi="Microsoft YaHei" w:eastAsia="Microsoft YaHei"/>
+          <w:b/>
+          <w:color w:val="27648A"/>
+          <w:sz w:val="22"/>
+        </w:rPr>
+        <w:t>手动安装（排错时使用）</w:t>
+      </w:r>
+    </w:p>
+    <w:p>
+      <w:pPr>
+        <w:spacing w:after="100" w:line="269" w:lineRule="auto"/>
+      </w:pPr>
+      <w:r>
+        <w:rPr>
+          <w:rFonts w:ascii="Microsoft YaHei" w:hAnsi="Microsoft YaHei" w:eastAsia="Microsoft YaHei"/>
+          <w:color w:val="263746"/>
+          <w:sz w:val="19"/>
+        </w:rPr>
+        <w:t>如果需要逐步安装，请在已激活的 Python 3.10 环境和项目根目录执行以下命令。SDK 会下载到 .dependencies/startouch_sdk，无需手动切换到 SDK 源码目录。</w:t>
       </w:r>
     </w:p>
     <w:p>
@@ -541,6 +651,17 @@
           <w:color w:val="203B50"/>
           <w:sz w:val="17"/>
         </w:rPr>
+        <w:t>python -m pip install --upgrade pip setuptools wheel</w:t>
+      </w:r>
+      <w:r>
+        <w:br/>
+      </w:r>
+      <w:r>
+        <w:rPr>
+          <w:rFonts w:ascii="Consolas" w:hAnsi="Consolas" w:eastAsia="Consolas"/>
+          <w:color w:val="203B50"/>
+          <w:sz w:val="17"/>
+        </w:rPr>
         <w:t>python -m pip install pyserial fashionstar-uart-sdk</w:t>
       </w:r>
       <w:r>
@@ -562,7 +683,7 @@
           <w:color w:val="203B50"/>
           <w:sz w:val="17"/>
         </w:rPr>
-        <w:t>cd /path/to/startouch_sdk</w:t>
+        <w:t>mkdir -p .dependencies</w:t>
       </w:r>
       <w:r>
         <w:br/>
@@ -573,7 +694,7 @@
           <w:color w:val="203B50"/>
           <w:sz w:val="17"/>
         </w:rPr>
-        <w:t>python -m pip install -r requirements.txt</w:t>
+        <w:t>if [ ! -d .dependencies/startouch_sdk ]; then</w:t>
       </w:r>
       <w:r>
         <w:br/>
@@ -584,37 +705,40 @@
           <w:color w:val="203B50"/>
           <w:sz w:val="17"/>
         </w:rPr>
-        <w:t>python -m pip install -e .</w:t>
+        <w:t xml:space="preserve">  git clone --depth 1 https://github.com/lumos-open/startouch_sdk.git .dependencies/startouch_sdk</w:t>
       </w:r>
-    </w:p>
-    <w:p>
-      <w:pPr>
-        <w:spacing w:after="100" w:line="269" w:lineRule="auto"/>
-      </w:pPr>
       <w:r>
-        <w:rPr>
-          <w:rFonts w:ascii="Microsoft YaHei" w:hAnsi="Microsoft YaHei" w:eastAsia="Microsoft YaHei"/>
-          <w:color w:val="263746"/>
-          <w:sz w:val="19"/>
-        </w:rPr>
-        <w:t>将 /path/to/startouch_sdk 替换为 Lumos SDK 在本机的实际目录。如果 Lumos SDK 安装时提示缺少 C++ 构建依赖，按 Lumos 安装指南安装上述系统依赖。安装完成后可检查接口：</w:t>
+        <w:br/>
       </w:r>
-    </w:p>
-    <w:p>
-      <w:pPr>
-        <w:pStyle w:val="CodeBlock"/>
-        <w:keepLines/>
-        <w:spacing w:before="40" w:after="140"/>
-        <w:ind w:left="202" w:right="115"/>
-        <w:shd w:fill="F3F6F8"/>
-      </w:pPr>
       <w:r>
         <w:rPr>
           <w:rFonts w:ascii="Consolas" w:hAnsi="Consolas" w:eastAsia="Consolas"/>
           <w:color w:val="203B50"/>
           <w:sz w:val="17"/>
         </w:rPr>
-        <w:t>python -c "import serial, fashionstar_uart_sdk; from startouchclass import SingleArm; print('SDK OK')"</w:t>
+        <w:t>fi</w:t>
+      </w:r>
+      <w:r>
+        <w:br/>
+      </w:r>
+      <w:r>
+        <w:rPr>
+          <w:rFonts w:ascii="Consolas" w:hAnsi="Consolas" w:eastAsia="Consolas"/>
+          <w:color w:val="203B50"/>
+          <w:sz w:val="17"/>
+        </w:rPr>
+        <w:t>python -m pip install -r .dependencies/startouch_sdk/requirements.txt</w:t>
+      </w:r>
+      <w:r>
+        <w:br/>
+      </w:r>
+      <w:r>
+        <w:rPr>
+          <w:rFonts w:ascii="Consolas" w:hAnsi="Consolas" w:eastAsia="Consolas"/>
+          <w:color w:val="203B50"/>
+          <w:sz w:val="17"/>
+        </w:rPr>
+        <w:t>python -m pip install .dependencies/startouch_sdk</w:t>
       </w:r>
     </w:p>
     <w:p>
@@ -642,7 +766,7 @@
           <w:color w:val="263746"/>
           <w:sz w:val="19"/>
         </w:rPr>
-        <w:t>将 stararm102_lumos_teleop.py 放到 Linux 主机的 ~/stararm102_lumos_teleop.py。查看 CAN 状态：</w:t>
+        <w:t>安装脚本已将程序放在项目根目录。确认 can0 状态：</w:t>
       </w:r>
     </w:p>
     <w:p>
@@ -1565,7 +1689,7 @@
                 <w:color w:val="263746"/>
                 <w:sz w:val="17"/>
               </w:rPr>
-              <w:t>在运行脚本的同一个 Python 环境安装 Lumos startouch_sdk；确认该环境可导入 SingleArm。</w:t>
+              <w:t>激活安装时使用的 Python 3.10 环境，在项目根目录运行 bash scripts/install_ubuntu.sh。</w:t>
             </w:r>
           </w:p>
         </w:tc>
@@ -1820,53 +1944,9 @@
           <w:color w:val="263746"/>
           <w:sz w:val="18"/>
         </w:rPr>
-        <w:t>Lumos SDK 安装指南：</w:t>
+        <w:t>StarArm 102 Python SDK：</w:t>
       </w:r>
       <w:hyperlink r:id="rId11">
-        <w:r>
-          <w:rPr>
-            <w:color w:val="27648A"/>
-            <w:u w:val="single"/>
-          </w:rPr>
-          <w:t>README_INSTALL.md</w:t>
-        </w:r>
-      </w:hyperlink>
-    </w:p>
-    <w:p>
-      <w:pPr>
-        <w:spacing w:after="60"/>
-      </w:pPr>
-      <w:r>
-        <w:rPr>
-          <w:rFonts w:ascii="Microsoft YaHei" w:hAnsi="Microsoft YaHei" w:eastAsia="Microsoft YaHei"/>
-          <w:color w:val="263746"/>
-          <w:sz w:val="18"/>
-        </w:rPr>
-        <w:t>Lumos Python API：</w:t>
-      </w:r>
-      <w:hyperlink r:id="rId12">
-        <w:r>
-          <w:rPr>
-            <w:color w:val="27648A"/>
-            <w:u w:val="single"/>
-          </w:rPr>
-          <w:t>README_API.md</w:t>
-        </w:r>
-      </w:hyperlink>
-    </w:p>
-    <w:p>
-      <w:pPr>
-        <w:spacing w:after="60"/>
-      </w:pPr>
-      <w:r>
-        <w:rPr>
-          <w:rFonts w:ascii="Microsoft YaHei" w:hAnsi="Microsoft YaHei" w:eastAsia="Microsoft YaHei"/>
-          <w:color w:val="263746"/>
-          <w:sz w:val="18"/>
-        </w:rPr>
-        <w:t>StarArm 102 Python SDK：</w:t>
-      </w:r>
-      <w:hyperlink r:id="rId13">
         <w:r>
           <w:rPr>
             <w:color w:val="27648A"/>

</xml_diff>

<commit_message>
Use official Star Arm 102 product name
</commit_message>
<xml_diff>
--- a/docs/StarArm102_Lumos_Python_Teleoperation_Guide.docx
+++ b/docs/StarArm102_Lumos_Python_Teleoperation_Guide.docx
@@ -14,7 +14,7 @@
           <w:color w:val="18354F"/>
           <w:sz w:val="50"/>
         </w:rPr>
-        <w:t>StarArm 102 控制 Lumos</w:t>
+        <w:t>Star Arm 102 控制 Lumos</w:t>
       </w:r>
     </w:p>
     <w:p>
@@ -71,7 +71,7 @@
                 <w:color w:val="263746"/>
                 <w:sz w:val="19"/>
               </w:rPr>
-              <w:t>用 StarArm 102 主臂实时控制 Lumos 单臂。程序通过 StarArm UART 和 Lumos CAN 通信，不使用 LeRobot。首次使用先校准，再预览，最后执行。</w:t>
+              <w:t>用 Star Arm 102 主臂实时控制 Lumos 单臂。程序通过 Star Arm UART 和 Lumos CAN 通信，不使用 LeRobot。首次使用先校准，再预览，最后执行。</w:t>
             </w:r>
           </w:p>
         </w:tc>
@@ -102,7 +102,7 @@
           <w:color w:val="263746"/>
           <w:sz w:val="19"/>
         </w:rPr>
-        <w:t>StarArm 102 主臂提供操作输入，Lumos 单臂作为被控机械臂。脚本读取 StarArm 六个关节和可选夹爪状态，再向 Lumos SDK 发送六关节目标和夹爪开度。</w:t>
+        <w:t>Star Arm 102 主臂提供操作输入，Lumos 单臂作为被控机械臂。脚本读取 Star Arm 102 的六个关节和可选夹爪状态，再向 Lumos SDK 发送六关节目标和夹爪开度。</w:t>
       </w:r>
     </w:p>
     <w:tbl>
@@ -230,7 +230,7 @@
                 <w:color w:val="263746"/>
                 <w:sz w:val="17"/>
               </w:rPr>
-              <w:t>StarArm 102 主臂</w:t>
+              <w:t>Star Arm 102 主臂</w:t>
             </w:r>
           </w:p>
         </w:tc>
@@ -1360,7 +1360,7 @@
           <w:color w:val="263746"/>
           <w:sz w:val="19"/>
         </w:rPr>
-        <w:t>在开始前，将 StarArm 102 与 Lumos 摆到相互对应且安全的参考姿态。Lumos SDK 连接时会使能电机；确认急停可用、工作区域畅通。</w:t>
+        <w:t>在开始前，将 Star Arm 102 与 Lumos 摆到相互对应且安全的参考姿态。Lumos SDK 连接时会使能电机；确认急停可用、工作区域畅通。</w:t>
       </w:r>
     </w:p>
     <w:p>
@@ -1944,7 +1944,7 @@
           <w:color w:val="263746"/>
           <w:sz w:val="18"/>
         </w:rPr>
-        <w:t>StarArm 102 Python SDK：</w:t>
+        <w:t>Star Arm 102 Python SDK：</w:t>
       </w:r>
       <w:hyperlink r:id="rId11">
         <w:r>
@@ -1981,7 +1981,7 @@
         <w:color w:val="586B78"/>
         <w:sz w:val="16"/>
       </w:rPr>
-      <w:t xml:space="preserve">StarArm 102 控制 Lumos  ·  </w:t>
+      <w:t xml:space="preserve">Star Arm 102 控制 Lumos  ·  </w:t>
     </w:r>
     <w:fldSimple w:instr="PAGE"/>
   </w:p>
@@ -2001,7 +2001,7 @@
         <w:color w:val="586B78"/>
         <w:sz w:val="16"/>
       </w:rPr>
-      <w:t>StarArm 102  |  Lumos  |  Python 操作指南</w:t>
+      <w:t>Star Arm 102  |  Lumos  |  Python 操作指南</w:t>
     </w:r>
   </w:p>
 </w:hdr>

</xml_diff>